<commit_message>
feat: unidad 14 · Monta tu presentación, arranque del bloque creativo
Incluye índice + 3 fichas, 2 escenas Excalidraw (scripts/gen-tienda-14.py),
sidebar/landing actualizados, pie de la unidad 13 enlazado, DOCX
regenerados (15), planaseguir.txt para el traspaso entre sesiones,
README y estado en AGENTS/HANDOFF.
</commit_message>
<xml_diff>
--- a/docx/13-ia-copiloto-de-estudio/13-ia-copiloto-de-estudio.docx
+++ b/docx/13-ia-copiloto-de-estudio/13-ia-copiloto-de-estudio.docx
@@ -28,7 +28,7 @@
         </w:p>
       </w:sdtContent>
     </w:sdt>
-    <w:bookmarkStart w:id="18" w:name="ia-copiloto-de-estudio"/>
+    <w:bookmarkStart w:id="19" w:name="ia-copiloto-de-estudio"/>
     <w:p>
       <w:pPr>
         <w:pStyle w:val="Heading1"/>
@@ -447,7 +447,7 @@
       </w:r>
     </w:p>
     <w:bookmarkEnd w:id="15"/>
-    <w:bookmarkStart w:id="17" w:name="por-dónde-empiezo"/>
+    <w:bookmarkStart w:id="18" w:name="por-dónde-empiezo"/>
     <w:p>
       <w:pPr>
         <w:pStyle w:val="Heading2"/>
@@ -546,7 +546,7 @@
         <w:t xml:space="preserve"> </w:t>
       </w:r>
       <w:r>
-        <w:t xml:space="preserve">Rétala ahora con</w:t>
+        <w:t xml:space="preserve">Practica con</w:t>
       </w:r>
       <w:r>
         <w:t xml:space="preserve"> </w:t>
@@ -563,12 +563,26 @@
         <w:t xml:space="preserve"> </w:t>
       </w:r>
       <w:r>
-        <w:t xml:space="preserve">o espera el bloque 🎨 creativo (en preparación).</w:t>
-      </w:r>
-    </w:p>
-    <w:bookmarkEnd w:id="17"/>
+        <w:t xml:space="preserve">o pasa al bloque 🎨 creativo:</w:t>
+      </w:r>
+      <w:r>
+        <w:t xml:space="preserve"> </w:t>
+      </w:r>
+      <w:hyperlink r:id="rId17">
+        <w:r>
+          <w:rPr>
+            <w:rStyle w:val="Hyperlink"/>
+          </w:rPr>
+          <w:t xml:space="preserve">Monta tu presentación</w:t>
+        </w:r>
+      </w:hyperlink>
+      <w:r>
+        <w:t xml:space="preserve">.</w:t>
+      </w:r>
+    </w:p>
     <w:bookmarkEnd w:id="18"/>
-    <w:bookmarkStart w:id="24" w:name="pregunta-bien-pide-claro"/>
+    <w:bookmarkEnd w:id="19"/>
+    <w:bookmarkStart w:id="25" w:name="pregunta-bien-pide-claro"/>
     <w:p>
       <w:pPr>
         <w:pStyle w:val="Heading1"/>
@@ -632,7 +646,7 @@
         </w:pict>
       </w:r>
     </w:p>
-    <w:bookmarkStart w:id="19" w:name="en-corto"/>
+    <w:bookmarkStart w:id="20" w:name="en-corto"/>
     <w:p>
       <w:pPr>
         <w:pStyle w:val="Heading2"/>
@@ -687,8 +701,8 @@
         </w:pict>
       </w:r>
     </w:p>
-    <w:bookmarkEnd w:id="19"/>
-    <w:bookmarkStart w:id="20" w:name="lo-que-hay-que-saber"/>
+    <w:bookmarkEnd w:id="20"/>
+    <w:bookmarkStart w:id="21" w:name="lo-que-hay-que-saber"/>
     <w:p>
       <w:pPr>
         <w:pStyle w:val="Heading2"/>
@@ -1214,8 +1228,8 @@
         <w:t xml:space="preserve">📝 Qué + para qué + cómo: la petición que sí devuelve lo que buscas</w:t>
       </w:r>
     </w:p>
-    <w:bookmarkEnd w:id="20"/>
-    <w:bookmarkStart w:id="21" w:name="a-por-ellos"/>
+    <w:bookmarkEnd w:id="21"/>
+    <w:bookmarkStart w:id="22" w:name="a-por-ellos"/>
     <w:p>
       <w:pPr>
         <w:pStyle w:val="Heading2"/>
@@ -1670,8 +1684,8 @@
         </w:pict>
       </w:r>
     </w:p>
-    <w:bookmarkEnd w:id="21"/>
-    <w:bookmarkStart w:id="23" w:name="X2f5258035fcb789a7146dcb5379943bb1b71052"/>
+    <w:bookmarkEnd w:id="22"/>
+    <w:bookmarkStart w:id="24" w:name="X2f5258035fcb789a7146dcb5379943bb1b71052"/>
     <w:p>
       <w:pPr>
         <w:pStyle w:val="Heading2"/>
@@ -1758,7 +1772,7 @@
       <w:r>
         <w:t xml:space="preserve"> </w:t>
       </w:r>
-      <w:hyperlink r:id="rId22">
+      <w:hyperlink r:id="rId23">
         <w:r>
           <w:rPr>
             <w:rStyle w:val="Hyperlink"/>
@@ -1785,7 +1799,7 @@
       <w:r>
         <w:t xml:space="preserve"> </w:t>
       </w:r>
-      <w:hyperlink r:id="rId22">
+      <w:hyperlink r:id="rId23">
         <w:r>
           <w:rPr>
             <w:rStyle w:val="Hyperlink"/>
@@ -1821,9 +1835,9 @@
         </w:r>
       </w:hyperlink>
     </w:p>
-    <w:bookmarkEnd w:id="23"/>
     <w:bookmarkEnd w:id="24"/>
-    <w:bookmarkStart w:id="29" w:name="el-copiloto-no-conduce"/>
+    <w:bookmarkEnd w:id="25"/>
+    <w:bookmarkStart w:id="30" w:name="el-copiloto-no-conduce"/>
     <w:p>
       <w:pPr>
         <w:pStyle w:val="Heading1"/>
@@ -1887,7 +1901,7 @@
         </w:pict>
       </w:r>
     </w:p>
-    <w:bookmarkStart w:id="25" w:name="en-corto-1"/>
+    <w:bookmarkStart w:id="26" w:name="en-corto-1"/>
     <w:p>
       <w:pPr>
         <w:pStyle w:val="Heading2"/>
@@ -1940,8 +1954,8 @@
         </w:pict>
       </w:r>
     </w:p>
-    <w:bookmarkEnd w:id="25"/>
-    <w:bookmarkStart w:id="26" w:name="lo-que-hay-que-saber-1"/>
+    <w:bookmarkEnd w:id="26"/>
+    <w:bookmarkStart w:id="27" w:name="lo-que-hay-que-saber-1"/>
     <w:p>
       <w:pPr>
         <w:pStyle w:val="Heading2"/>
@@ -2417,8 +2431,8 @@
         <w:t xml:space="preserve">🚦 Verde: te trae material · Ámbar: te explica, luego lo explicas tú · Rojo: trabaja por ti</w:t>
       </w:r>
     </w:p>
-    <w:bookmarkEnd w:id="26"/>
-    <w:bookmarkStart w:id="27" w:name="a-por-ellos-1"/>
+    <w:bookmarkEnd w:id="27"/>
+    <w:bookmarkStart w:id="28" w:name="a-por-ellos-1"/>
     <w:p>
       <w:pPr>
         <w:pStyle w:val="Heading2"/>
@@ -2839,8 +2853,8 @@
         </w:pict>
       </w:r>
     </w:p>
-    <w:bookmarkEnd w:id="27"/>
-    <w:bookmarkStart w:id="28" w:name="Xf9adb28ef79fab65f5fb8390dc2cb21b723bba0"/>
+    <w:bookmarkEnd w:id="28"/>
+    <w:bookmarkStart w:id="29" w:name="Xf9adb28ef79fab65f5fb8390dc2cb21b723bba0"/>
     <w:p>
       <w:pPr>
         <w:pStyle w:val="Heading2"/>
@@ -2914,7 +2928,7 @@
       <w:r>
         <w:t xml:space="preserve"> </w:t>
       </w:r>
-      <w:hyperlink r:id="rId22">
+      <w:hyperlink r:id="rId23">
         <w:r>
           <w:rPr>
             <w:rStyle w:val="Hyperlink"/>
@@ -2977,9 +2991,9 @@
         </w:r>
       </w:hyperlink>
     </w:p>
-    <w:bookmarkEnd w:id="28"/>
     <w:bookmarkEnd w:id="29"/>
-    <w:bookmarkStart w:id="38" w:name="juegos-y-retos"/>
+    <w:bookmarkEnd w:id="30"/>
+    <w:bookmarkStart w:id="39" w:name="juegos-y-retos"/>
     <w:p>
       <w:pPr>
         <w:pStyle w:val="Heading1"/>
@@ -3043,7 +3057,7 @@
         </w:pict>
       </w:r>
     </w:p>
-    <w:bookmarkStart w:id="30" w:name="en-corto-2"/>
+    <w:bookmarkStart w:id="31" w:name="en-corto-2"/>
     <w:p>
       <w:pPr>
         <w:pStyle w:val="Heading2"/>
@@ -3080,8 +3094,8 @@
         </w:pict>
       </w:r>
     </w:p>
-    <w:bookmarkEnd w:id="30"/>
-    <w:bookmarkStart w:id="31" w:name="el-fail-de-dani"/>
+    <w:bookmarkEnd w:id="31"/>
+    <w:bookmarkStart w:id="32" w:name="el-fail-de-dani"/>
     <w:p>
       <w:pPr>
         <w:pStyle w:val="Heading2"/>
@@ -3263,8 +3277,8 @@
         </w:pict>
       </w:r>
     </w:p>
-    <w:bookmarkEnd w:id="31"/>
-    <w:bookmarkStart w:id="32" w:name="juego-1-el-duelo-ia-tú-15-min"/>
+    <w:bookmarkEnd w:id="32"/>
+    <w:bookmarkStart w:id="33" w:name="juego-1-el-duelo-ia-tú-15-min"/>
     <w:p>
       <w:pPr>
         <w:pStyle w:val="Heading2"/>
@@ -3402,8 +3416,8 @@
         </w:pict>
       </w:r>
     </w:p>
-    <w:bookmarkEnd w:id="32"/>
-    <w:bookmarkStart w:id="33" w:name="juego-2-detecta-el-copia-pega-10-min"/>
+    <w:bookmarkEnd w:id="33"/>
+    <w:bookmarkStart w:id="34" w:name="juego-2-detecta-el-copia-pega-10-min"/>
     <w:p>
       <w:pPr>
         <w:pStyle w:val="Heading2"/>
@@ -3463,8 +3477,8 @@
         </w:pict>
       </w:r>
     </w:p>
-    <w:bookmarkEnd w:id="33"/>
-    <w:bookmarkStart w:id="34" w:name="juego-3-la-ia-que-te-evalúa-8-min"/>
+    <w:bookmarkEnd w:id="34"/>
+    <w:bookmarkStart w:id="35" w:name="juego-3-la-ia-que-te-evalúa-8-min"/>
     <w:p>
       <w:pPr>
         <w:pStyle w:val="Heading2"/>
@@ -3533,8 +3547,8 @@
         </w:pict>
       </w:r>
     </w:p>
-    <w:bookmarkEnd w:id="34"/>
-    <w:bookmarkStart w:id="35" w:name="logros"/>
+    <w:bookmarkEnd w:id="35"/>
+    <w:bookmarkStart w:id="36" w:name="logros"/>
     <w:p>
       <w:pPr>
         <w:pStyle w:val="Heading2"/>
@@ -3759,8 +3773,8 @@
         </w:pict>
       </w:r>
     </w:p>
-    <w:bookmarkEnd w:id="35"/>
-    <w:bookmarkStart w:id="36" w:name="reto-final"/>
+    <w:bookmarkEnd w:id="36"/>
+    <w:bookmarkStart w:id="37" w:name="reto-final"/>
     <w:p>
       <w:pPr>
         <w:pStyle w:val="Heading2"/>
@@ -3901,8 +3915,8 @@
         </w:pict>
       </w:r>
     </w:p>
-    <w:bookmarkEnd w:id="36"/>
-    <w:bookmarkStart w:id="37" w:name="para-el-profe"/>
+    <w:bookmarkEnd w:id="37"/>
+    <w:bookmarkStart w:id="38" w:name="para-el-profe"/>
     <w:p>
       <w:pPr>
         <w:pStyle w:val="Heading2"/>
@@ -3965,7 +3979,7 @@
       <w:r>
         <w:t xml:space="preserve"> </w:t>
       </w:r>
-      <w:hyperlink r:id="rId22">
+      <w:hyperlink r:id="rId23">
         <w:r>
           <w:rPr>
             <w:rStyle w:val="Hyperlink"/>
@@ -4028,8 +4042,8 @@
         </w:r>
       </w:hyperlink>
     </w:p>
-    <w:bookmarkEnd w:id="37"/>
     <w:bookmarkEnd w:id="38"/>
+    <w:bookmarkEnd w:id="39"/>
     <w:sectPr>
       <w:footnotePr>
         <w:numRestart w:val="eachSect"/>

</xml_diff>